<commit_message>
fix: claim docx style-preserving cell fills and notes fields
</commit_message>
<xml_diff>
--- a/server/assets/claim-mould.docx
+++ b/server/assets/claim-mould.docx
@@ -330,11 +330,12 @@
             <w:tcW w:w="6173" w:type="dxa"/>
             <w:gridSpan w:val="6"/>
             <w:noWrap/>
-            <w:vAlign w:val="bottom"/>
+            <w:vAlign w:val="center"/>
           </w:tcPr>
           <w:p>
             <w:pPr>
               <w:widowControl/>
+              <w:jc w:val="left"/>
               <w:rPr>
                 <w:rFonts w:ascii="Arial" w:eastAsia="SimSun" w:hAnsi="Arial" w:cs="Arial"/>
                 <w:color w:val="000000"/>
@@ -564,22 +565,16 @@
             <w:tcW w:w="6173" w:type="dxa"/>
             <w:gridSpan w:val="6"/>
             <w:noWrap/>
-            <w:vAlign w:val="bottom"/>
-          </w:tcPr>
-          <w:p>
-            <w:pPr>
+            <w:vAlign w:val="center"/>
+          </w:tcPr>
+          <w:p>
+            <w:pPr>
+              <w:jc w:val="center"/>
               <w:rPr>
                 <w:rFonts w:ascii="Calibri" w:eastAsia="Times New Roman" w:hAnsi="Calibri" w:cs="Times New Roman"/>
                 <w:color w:val="000000"/>
               </w:rPr>
             </w:pPr>
-            <w:r>
-              <w:rPr>
-                <w:rFonts w:ascii="Calibri" w:eastAsia="Times New Roman" w:hAnsi="Calibri" w:cs="Times New Roman"/>
-                <w:color w:val="000000"/>
-              </w:rPr>
-              <w:t> </w:t>
-            </w:r>
           </w:p>
         </w:tc>
       </w:tr>
@@ -619,22 +614,16 @@
             <w:tcW w:w="6173" w:type="dxa"/>
             <w:gridSpan w:val="6"/>
             <w:noWrap/>
-            <w:vAlign w:val="bottom"/>
-          </w:tcPr>
-          <w:p>
-            <w:pPr>
+            <w:vAlign w:val="center"/>
+          </w:tcPr>
+          <w:p>
+            <w:pPr>
+              <w:jc w:val="center"/>
               <w:rPr>
                 <w:rFonts w:ascii="Calibri" w:eastAsia="Times New Roman" w:hAnsi="Calibri" w:cs="Times New Roman"/>
                 <w:color w:val="000000"/>
               </w:rPr>
             </w:pPr>
-            <w:r>
-              <w:rPr>
-                <w:rFonts w:ascii="Calibri" w:eastAsia="Times New Roman" w:hAnsi="Calibri" w:cs="Times New Roman"/>
-                <w:color w:val="000000"/>
-              </w:rPr>
-              <w:t> </w:t>
-            </w:r>
           </w:p>
         </w:tc>
       </w:tr>
@@ -1989,7 +1978,7 @@
               <w:right w:val="single" w:sz="4" w:space="0" w:color="auto"/>
             </w:tcBorders>
             <w:noWrap/>
-            <w:vAlign w:val="bottom"/>
+            <w:vAlign w:val="center"/>
           </w:tcPr>
           <w:p>
             <w:pPr>
@@ -2018,7 +2007,7 @@
               <w:right w:val="single" w:sz="4" w:space="0" w:color="auto"/>
             </w:tcBorders>
             <w:noWrap/>
-            <w:vAlign w:val="bottom"/>
+            <w:vAlign w:val="center"/>
           </w:tcPr>
           <w:p>
             <w:pPr>
@@ -2040,7 +2029,7 @@
               <w:right w:val="single" w:sz="4" w:space="0" w:color="auto"/>
             </w:tcBorders>
             <w:noWrap/>
-            <w:vAlign w:val="bottom"/>
+            <w:vAlign w:val="center"/>
           </w:tcPr>
           <w:p>
             <w:pPr>
@@ -2062,7 +2051,7 @@
               <w:right w:val="single" w:sz="4" w:space="0" w:color="auto"/>
             </w:tcBorders>
             <w:noWrap/>
-            <w:vAlign w:val="bottom"/>
+            <w:vAlign w:val="center"/>
           </w:tcPr>
           <w:p>
             <w:pPr>
@@ -2084,7 +2073,7 @@
               <w:right w:val="single" w:sz="4" w:space="0" w:color="auto"/>
             </w:tcBorders>
             <w:noWrap/>
-            <w:vAlign w:val="bottom"/>
+            <w:vAlign w:val="center"/>
           </w:tcPr>
           <w:p>
             <w:pPr>
@@ -2106,7 +2095,7 @@
               <w:right w:val="single" w:sz="4" w:space="0" w:color="auto"/>
             </w:tcBorders>
             <w:noWrap/>
-            <w:vAlign w:val="bottom"/>
+            <w:vAlign w:val="center"/>
           </w:tcPr>
           <w:p>
             <w:pPr>
@@ -2134,7 +2123,7 @@
               <w:right w:val="single" w:sz="4" w:space="0" w:color="auto"/>
             </w:tcBorders>
             <w:noWrap/>
-            <w:vAlign w:val="bottom"/>
+            <w:vAlign w:val="center"/>
           </w:tcPr>
           <w:p>
             <w:pPr>
@@ -2163,7 +2152,7 @@
               <w:right w:val="single" w:sz="4" w:space="0" w:color="auto"/>
             </w:tcBorders>
             <w:noWrap/>
-            <w:vAlign w:val="bottom"/>
+            <w:vAlign w:val="center"/>
           </w:tcPr>
           <w:p>
             <w:pPr>
@@ -2185,7 +2174,7 @@
               <w:right w:val="single" w:sz="4" w:space="0" w:color="auto"/>
             </w:tcBorders>
             <w:noWrap/>
-            <w:vAlign w:val="bottom"/>
+            <w:vAlign w:val="center"/>
           </w:tcPr>
           <w:p>
             <w:pPr>
@@ -2207,7 +2196,7 @@
               <w:right w:val="single" w:sz="4" w:space="0" w:color="auto"/>
             </w:tcBorders>
             <w:noWrap/>
-            <w:vAlign w:val="bottom"/>
+            <w:vAlign w:val="center"/>
           </w:tcPr>
           <w:p>
             <w:pPr>
@@ -2229,7 +2218,7 @@
               <w:right w:val="single" w:sz="4" w:space="0" w:color="auto"/>
             </w:tcBorders>
             <w:noWrap/>
-            <w:vAlign w:val="bottom"/>
+            <w:vAlign w:val="center"/>
           </w:tcPr>
           <w:p>
             <w:pPr>
@@ -2251,7 +2240,7 @@
               <w:right w:val="single" w:sz="4" w:space="0" w:color="auto"/>
             </w:tcBorders>
             <w:noWrap/>
-            <w:vAlign w:val="bottom"/>
+            <w:vAlign w:val="center"/>
           </w:tcPr>
           <w:p>
             <w:pPr>
@@ -2279,7 +2268,7 @@
               <w:right w:val="single" w:sz="4" w:space="0" w:color="auto"/>
             </w:tcBorders>
             <w:noWrap/>
-            <w:vAlign w:val="bottom"/>
+            <w:vAlign w:val="center"/>
           </w:tcPr>
           <w:p>
             <w:pPr>
@@ -2308,7 +2297,7 @@
               <w:right w:val="single" w:sz="4" w:space="0" w:color="auto"/>
             </w:tcBorders>
             <w:noWrap/>
-            <w:vAlign w:val="bottom"/>
+            <w:vAlign w:val="center"/>
           </w:tcPr>
           <w:p>
             <w:pPr>
@@ -2330,7 +2319,7 @@
               <w:right w:val="single" w:sz="4" w:space="0" w:color="auto"/>
             </w:tcBorders>
             <w:noWrap/>
-            <w:vAlign w:val="bottom"/>
+            <w:vAlign w:val="center"/>
           </w:tcPr>
           <w:p>
             <w:pPr>
@@ -2352,7 +2341,7 @@
               <w:right w:val="single" w:sz="4" w:space="0" w:color="auto"/>
             </w:tcBorders>
             <w:noWrap/>
-            <w:vAlign w:val="bottom"/>
+            <w:vAlign w:val="center"/>
           </w:tcPr>
           <w:p>
             <w:pPr>
@@ -2374,7 +2363,7 @@
               <w:right w:val="single" w:sz="4" w:space="0" w:color="auto"/>
             </w:tcBorders>
             <w:noWrap/>
-            <w:vAlign w:val="bottom"/>
+            <w:vAlign w:val="center"/>
           </w:tcPr>
           <w:p>
             <w:pPr>
@@ -2396,7 +2385,7 @@
               <w:right w:val="single" w:sz="4" w:space="0" w:color="auto"/>
             </w:tcBorders>
             <w:noWrap/>
-            <w:vAlign w:val="bottom"/>
+            <w:vAlign w:val="center"/>
           </w:tcPr>
           <w:p>
             <w:pPr>
@@ -2424,7 +2413,7 @@
               <w:right w:val="single" w:sz="4" w:space="0" w:color="auto"/>
             </w:tcBorders>
             <w:noWrap/>
-            <w:vAlign w:val="bottom"/>
+            <w:vAlign w:val="center"/>
           </w:tcPr>
           <w:p>
             <w:pPr>
@@ -2453,11 +2442,12 @@
               <w:right w:val="single" w:sz="4" w:space="0" w:color="auto"/>
             </w:tcBorders>
             <w:noWrap/>
-            <w:vAlign w:val="bottom"/>
+            <w:vAlign w:val="center"/>
           </w:tcPr>
           <w:p>
             <w:pPr>
               <w:widowControl/>
+              <w:jc w:val="center"/>
               <w:rPr>
                 <w:rFonts w:ascii="Arial" w:eastAsia="Microsoft YaHei" w:hAnsi="Arial" w:cs="Arial"/>
                 <w:color w:val="000000"/>
@@ -2475,7 +2465,7 @@
               <w:right w:val="single" w:sz="4" w:space="0" w:color="auto"/>
             </w:tcBorders>
             <w:noWrap/>
-            <w:vAlign w:val="bottom"/>
+            <w:vAlign w:val="center"/>
           </w:tcPr>
           <w:p>
             <w:pPr>
@@ -2497,7 +2487,7 @@
               <w:right w:val="single" w:sz="4" w:space="0" w:color="auto"/>
             </w:tcBorders>
             <w:noWrap/>
-            <w:vAlign w:val="bottom"/>
+            <w:vAlign w:val="center"/>
           </w:tcPr>
           <w:p>
             <w:pPr>
@@ -2519,7 +2509,7 @@
               <w:right w:val="single" w:sz="4" w:space="0" w:color="auto"/>
             </w:tcBorders>
             <w:noWrap/>
-            <w:vAlign w:val="bottom"/>
+            <w:vAlign w:val="center"/>
           </w:tcPr>
           <w:p>
             <w:pPr>
@@ -2541,7 +2531,7 @@
               <w:right w:val="single" w:sz="4" w:space="0" w:color="auto"/>
             </w:tcBorders>
             <w:noWrap/>
-            <w:vAlign w:val="bottom"/>
+            <w:vAlign w:val="center"/>
           </w:tcPr>
           <w:p>
             <w:pPr>
@@ -2569,7 +2559,7 @@
               <w:right w:val="single" w:sz="4" w:space="0" w:color="auto"/>
             </w:tcBorders>
             <w:noWrap/>
-            <w:vAlign w:val="bottom"/>
+            <w:vAlign w:val="center"/>
           </w:tcPr>
           <w:p>
             <w:pPr>
@@ -2714,7 +2704,7 @@
               <w:right w:val="single" w:sz="4" w:space="0" w:color="auto"/>
             </w:tcBorders>
             <w:noWrap/>
-            <w:vAlign w:val="bottom"/>
+            <w:vAlign w:val="center"/>
           </w:tcPr>
           <w:p>
             <w:pPr>
@@ -2859,7 +2849,7 @@
               <w:right w:val="single" w:sz="4" w:space="0" w:color="auto"/>
             </w:tcBorders>
             <w:noWrap/>
-            <w:vAlign w:val="bottom"/>
+            <w:vAlign w:val="center"/>
           </w:tcPr>
           <w:p>
             <w:pPr>
@@ -2888,10 +2878,11 @@
               <w:right w:val="single" w:sz="4" w:space="0" w:color="auto"/>
             </w:tcBorders>
             <w:noWrap/>
-            <w:vAlign w:val="bottom"/>
-          </w:tcPr>
-          <w:p>
-            <w:pPr>
+            <w:vAlign w:val="center"/>
+          </w:tcPr>
+          <w:p>
+            <w:pPr>
+              <w:jc w:val="center"/>
               <w:rPr>
                 <w:rFonts w:ascii="Arial" w:eastAsia="Microsoft YaHei" w:hAnsi="Arial" w:cs="Arial"/>
                 <w:color w:val="000000"/>
@@ -2909,7 +2900,7 @@
               <w:right w:val="single" w:sz="4" w:space="0" w:color="auto"/>
             </w:tcBorders>
             <w:noWrap/>
-            <w:vAlign w:val="bottom"/>
+            <w:vAlign w:val="center"/>
           </w:tcPr>
           <w:p>
             <w:pPr>
@@ -2931,7 +2922,7 @@
               <w:right w:val="single" w:sz="4" w:space="0" w:color="auto"/>
             </w:tcBorders>
             <w:noWrap/>
-            <w:vAlign w:val="bottom"/>
+            <w:vAlign w:val="center"/>
           </w:tcPr>
           <w:p>
             <w:pPr>
@@ -2953,7 +2944,7 @@
               <w:right w:val="single" w:sz="4" w:space="0" w:color="auto"/>
             </w:tcBorders>
             <w:noWrap/>
-            <w:vAlign w:val="bottom"/>
+            <w:vAlign w:val="center"/>
           </w:tcPr>
           <w:p>
             <w:pPr>
@@ -2975,10 +2966,11 @@
               <w:right w:val="single" w:sz="4" w:space="0" w:color="auto"/>
             </w:tcBorders>
             <w:noWrap/>
-            <w:vAlign w:val="bottom"/>
-          </w:tcPr>
-          <w:p>
-            <w:pPr>
+            <w:vAlign w:val="center"/>
+          </w:tcPr>
+          <w:p>
+            <w:pPr>
+              <w:jc w:val="center"/>
               <w:rPr>
                 <w:rFonts w:ascii="Arial" w:eastAsia="Microsoft YaHei" w:hAnsi="Arial" w:cs="Arial"/>
                 <w:color w:val="000000"/>
@@ -3002,7 +2994,7 @@
               <w:right w:val="single" w:sz="4" w:space="0" w:color="auto"/>
             </w:tcBorders>
             <w:noWrap/>
-            <w:vAlign w:val="bottom"/>
+            <w:vAlign w:val="center"/>
           </w:tcPr>
           <w:p>
             <w:pPr>
@@ -3031,10 +3023,11 @@
               <w:right w:val="single" w:sz="4" w:space="0" w:color="auto"/>
             </w:tcBorders>
             <w:noWrap/>
-            <w:vAlign w:val="bottom"/>
-          </w:tcPr>
-          <w:p>
-            <w:pPr>
+            <w:vAlign w:val="center"/>
+          </w:tcPr>
+          <w:p>
+            <w:pPr>
+              <w:jc w:val="center"/>
               <w:rPr>
                 <w:rFonts w:ascii="Arial" w:eastAsia="Microsoft YaHei" w:hAnsi="Arial" w:cs="Arial"/>
                 <w:color w:val="000000"/>
@@ -3052,7 +3045,7 @@
               <w:right w:val="single" w:sz="4" w:space="0" w:color="auto"/>
             </w:tcBorders>
             <w:noWrap/>
-            <w:vAlign w:val="bottom"/>
+            <w:vAlign w:val="center"/>
           </w:tcPr>
           <w:p>
             <w:pPr>
@@ -3074,7 +3067,7 @@
               <w:right w:val="single" w:sz="4" w:space="0" w:color="auto"/>
             </w:tcBorders>
             <w:noWrap/>
-            <w:vAlign w:val="bottom"/>
+            <w:vAlign w:val="center"/>
           </w:tcPr>
           <w:p>
             <w:pPr>
@@ -3096,7 +3089,7 @@
               <w:right w:val="single" w:sz="4" w:space="0" w:color="auto"/>
             </w:tcBorders>
             <w:noWrap/>
-            <w:vAlign w:val="bottom"/>
+            <w:vAlign w:val="center"/>
           </w:tcPr>
           <w:p>
             <w:pPr>
@@ -3118,10 +3111,11 @@
               <w:right w:val="single" w:sz="4" w:space="0" w:color="auto"/>
             </w:tcBorders>
             <w:noWrap/>
-            <w:vAlign w:val="bottom"/>
-          </w:tcPr>
-          <w:p>
-            <w:pPr>
+            <w:vAlign w:val="center"/>
+          </w:tcPr>
+          <w:p>
+            <w:pPr>
+              <w:jc w:val="center"/>
               <w:rPr>
                 <w:rFonts w:ascii="Arial" w:eastAsia="Microsoft YaHei" w:hAnsi="Arial" w:cs="Arial"/>
                 <w:color w:val="000000"/>
@@ -3145,7 +3139,7 @@
               <w:right w:val="single" w:sz="4" w:space="0" w:color="auto"/>
             </w:tcBorders>
             <w:noWrap/>
-            <w:vAlign w:val="bottom"/>
+            <w:vAlign w:val="center"/>
           </w:tcPr>
           <w:p>
             <w:pPr>
@@ -3174,10 +3168,11 @@
               <w:right w:val="single" w:sz="4" w:space="0" w:color="auto"/>
             </w:tcBorders>
             <w:noWrap/>
-            <w:vAlign w:val="bottom"/>
-          </w:tcPr>
-          <w:p>
-            <w:pPr>
+            <w:vAlign w:val="center"/>
+          </w:tcPr>
+          <w:p>
+            <w:pPr>
+              <w:jc w:val="center"/>
               <w:rPr>
                 <w:rFonts w:ascii="Arial" w:eastAsia="Microsoft YaHei" w:hAnsi="Arial" w:cs="Arial"/>
                 <w:color w:val="000000"/>
@@ -3195,7 +3190,7 @@
               <w:right w:val="single" w:sz="4" w:space="0" w:color="auto"/>
             </w:tcBorders>
             <w:noWrap/>
-            <w:vAlign w:val="bottom"/>
+            <w:vAlign w:val="center"/>
           </w:tcPr>
           <w:p>
             <w:pPr>
@@ -3217,7 +3212,7 @@
               <w:right w:val="single" w:sz="4" w:space="0" w:color="auto"/>
             </w:tcBorders>
             <w:noWrap/>
-            <w:vAlign w:val="bottom"/>
+            <w:vAlign w:val="center"/>
           </w:tcPr>
           <w:p>
             <w:pPr>
@@ -3239,7 +3234,7 @@
               <w:right w:val="single" w:sz="4" w:space="0" w:color="auto"/>
             </w:tcBorders>
             <w:noWrap/>
-            <w:vAlign w:val="bottom"/>
+            <w:vAlign w:val="center"/>
           </w:tcPr>
           <w:p>
             <w:pPr>
@@ -3261,10 +3256,11 @@
               <w:right w:val="single" w:sz="4" w:space="0" w:color="auto"/>
             </w:tcBorders>
             <w:noWrap/>
-            <w:vAlign w:val="bottom"/>
-          </w:tcPr>
-          <w:p>
-            <w:pPr>
+            <w:vAlign w:val="center"/>
+          </w:tcPr>
+          <w:p>
+            <w:pPr>
+              <w:jc w:val="center"/>
               <w:rPr>
                 <w:rFonts w:ascii="Arial" w:eastAsia="Microsoft YaHei" w:hAnsi="Arial" w:cs="Arial"/>
                 <w:color w:val="000000"/>
@@ -3288,7 +3284,7 @@
               <w:right w:val="single" w:sz="4" w:space="0" w:color="auto"/>
             </w:tcBorders>
             <w:noWrap/>
-            <w:vAlign w:val="bottom"/>
+            <w:vAlign w:val="center"/>
           </w:tcPr>
           <w:p>
             <w:pPr>
@@ -3317,10 +3313,11 @@
               <w:right w:val="single" w:sz="4" w:space="0" w:color="auto"/>
             </w:tcBorders>
             <w:noWrap/>
-            <w:vAlign w:val="bottom"/>
-          </w:tcPr>
-          <w:p>
-            <w:pPr>
+            <w:vAlign w:val="center"/>
+          </w:tcPr>
+          <w:p>
+            <w:pPr>
+              <w:jc w:val="center"/>
               <w:rPr>
                 <w:rFonts w:ascii="Arial" w:eastAsia="Microsoft YaHei" w:hAnsi="Arial" w:cs="Arial"/>
                 <w:color w:val="000000"/>
@@ -3338,7 +3335,7 @@
               <w:right w:val="single" w:sz="4" w:space="0" w:color="auto"/>
             </w:tcBorders>
             <w:noWrap/>
-            <w:vAlign w:val="bottom"/>
+            <w:vAlign w:val="center"/>
           </w:tcPr>
           <w:p>
             <w:pPr>
@@ -3360,7 +3357,7 @@
               <w:right w:val="single" w:sz="4" w:space="0" w:color="auto"/>
             </w:tcBorders>
             <w:noWrap/>
-            <w:vAlign w:val="bottom"/>
+            <w:vAlign w:val="center"/>
           </w:tcPr>
           <w:p>
             <w:pPr>
@@ -3382,7 +3379,7 @@
               <w:right w:val="single" w:sz="4" w:space="0" w:color="auto"/>
             </w:tcBorders>
             <w:noWrap/>
-            <w:vAlign w:val="bottom"/>
+            <w:vAlign w:val="center"/>
           </w:tcPr>
           <w:p>
             <w:pPr>
@@ -3404,10 +3401,11 @@
               <w:right w:val="single" w:sz="4" w:space="0" w:color="auto"/>
             </w:tcBorders>
             <w:noWrap/>
-            <w:vAlign w:val="bottom"/>
-          </w:tcPr>
-          <w:p>
-            <w:pPr>
+            <w:vAlign w:val="center"/>
+          </w:tcPr>
+          <w:p>
+            <w:pPr>
+              <w:jc w:val="center"/>
               <w:rPr>
                 <w:rFonts w:ascii="Arial" w:eastAsia="Microsoft YaHei" w:hAnsi="Arial" w:cs="Arial"/>
                 <w:color w:val="000000"/>
@@ -3431,7 +3429,7 @@
               <w:right w:val="single" w:sz="4" w:space="0" w:color="auto"/>
             </w:tcBorders>
             <w:noWrap/>
-            <w:vAlign w:val="bottom"/>
+            <w:vAlign w:val="center"/>
           </w:tcPr>
           <w:p>
             <w:pPr>
@@ -3460,10 +3458,11 @@
               <w:right w:val="single" w:sz="4" w:space="0" w:color="auto"/>
             </w:tcBorders>
             <w:noWrap/>
-            <w:vAlign w:val="bottom"/>
-          </w:tcPr>
-          <w:p>
-            <w:pPr>
+            <w:vAlign w:val="center"/>
+          </w:tcPr>
+          <w:p>
+            <w:pPr>
+              <w:jc w:val="center"/>
               <w:rPr>
                 <w:rFonts w:ascii="Arial" w:eastAsia="Microsoft YaHei" w:hAnsi="Arial" w:cs="Arial"/>
                 <w:color w:val="000000"/>
@@ -3481,7 +3480,7 @@
               <w:right w:val="single" w:sz="4" w:space="0" w:color="auto"/>
             </w:tcBorders>
             <w:noWrap/>
-            <w:vAlign w:val="bottom"/>
+            <w:vAlign w:val="center"/>
           </w:tcPr>
           <w:p>
             <w:pPr>
@@ -3503,7 +3502,7 @@
               <w:right w:val="single" w:sz="4" w:space="0" w:color="auto"/>
             </w:tcBorders>
             <w:noWrap/>
-            <w:vAlign w:val="bottom"/>
+            <w:vAlign w:val="center"/>
           </w:tcPr>
           <w:p>
             <w:pPr>
@@ -3525,7 +3524,7 @@
               <w:right w:val="single" w:sz="4" w:space="0" w:color="auto"/>
             </w:tcBorders>
             <w:noWrap/>
-            <w:vAlign w:val="bottom"/>
+            <w:vAlign w:val="center"/>
           </w:tcPr>
           <w:p>
             <w:pPr>
@@ -3547,10 +3546,11 @@
               <w:right w:val="single" w:sz="4" w:space="0" w:color="auto"/>
             </w:tcBorders>
             <w:noWrap/>
-            <w:vAlign w:val="bottom"/>
-          </w:tcPr>
-          <w:p>
-            <w:pPr>
+            <w:vAlign w:val="center"/>
+          </w:tcPr>
+          <w:p>
+            <w:pPr>
+              <w:jc w:val="center"/>
               <w:rPr>
                 <w:rFonts w:ascii="Arial" w:eastAsia="Microsoft YaHei" w:hAnsi="Arial" w:cs="Arial"/>
                 <w:color w:val="000000"/>
@@ -6010,7 +6010,11 @@
 </file>
 
 <file path=customXml/item2.xml><?xml version="1.0" encoding="utf-8"?>
-<b:Sources xmlns:b="http://schemas.openxmlformats.org/officeDocument/2006/bibliography" xmlns="http://schemas.openxmlformats.org/officeDocument/2006/bibliography" SelectedStyle="\APASixthEditionOfficeOnline.xsl" StyleName="APA" Version="6"/>
+<p:properties xmlns:p="http://schemas.microsoft.com/office/2006/metadata/properties" xmlns:xsi="http://www.w3.org/2001/XMLSchema-instance" xmlns:pc="http://schemas.microsoft.com/office/infopath/2007/PartnerControls">
+  <documentManagement>
+    <_activity xmlns="d70503b2-13f4-43ba-b220-f86cd2e276e4" xsi:nil="true"/>
+  </documentManagement>
+</p:properties>
 </file>
 
 <file path=customXml/item3.xml><?xml version="1.0" encoding="utf-8"?>
@@ -6023,11 +6027,7 @@
 </file>
 
 <file path=customXml/item4.xml><?xml version="1.0" encoding="utf-8"?>
-<p:properties xmlns:p="http://schemas.microsoft.com/office/2006/metadata/properties" xmlns:xsi="http://www.w3.org/2001/XMLSchema-instance" xmlns:pc="http://schemas.microsoft.com/office/infopath/2007/PartnerControls">
-  <documentManagement>
-    <_activity xmlns="d70503b2-13f4-43ba-b220-f86cd2e276e4" xsi:nil="true"/>
-  </documentManagement>
-</p:properties>
+<b:Sources xmlns:b="http://schemas.openxmlformats.org/officeDocument/2006/bibliography" xmlns="http://schemas.openxmlformats.org/officeDocument/2006/bibliography" SelectedStyle="\APASixthEditionOfficeOnline.xsl" StyleName="APA" Version="6"/>
 </file>
 
 <file path=customXml/itemProps1.xml><?xml version="1.0" encoding="utf-8"?>
@@ -6049,9 +6049,11 @@
 </file>
 
 <file path=customXml/itemProps2.xml><?xml version="1.0" encoding="utf-8"?>
-<ds:datastoreItem xmlns:ds="http://schemas.openxmlformats.org/officeDocument/2006/customXml" ds:itemID="{120CAF19-C495-FF4C-843D-10892E24CD0C}">
+<ds:datastoreItem xmlns:ds="http://schemas.openxmlformats.org/officeDocument/2006/customXml" ds:itemID="{46412A0F-D8C6-4346-99B4-20A10514A26B}">
   <ds:schemaRefs>
-    <ds:schemaRef ds:uri="http://schemas.openxmlformats.org/officeDocument/2006/bibliography"/>
+    <ds:schemaRef ds:uri="http://schemas.microsoft.com/office/2006/metadata/properties"/>
+    <ds:schemaRef ds:uri="http://schemas.microsoft.com/office/infopath/2007/PartnerControls"/>
+    <ds:schemaRef ds:uri="d70503b2-13f4-43ba-b220-f86cd2e276e4"/>
   </ds:schemaRefs>
 </ds:datastoreItem>
 </file>
@@ -6065,11 +6067,9 @@
 </file>
 
 <file path=customXml/itemProps4.xml><?xml version="1.0" encoding="utf-8"?>
-<ds:datastoreItem xmlns:ds="http://schemas.openxmlformats.org/officeDocument/2006/customXml" ds:itemID="{46412A0F-D8C6-4346-99B4-20A10514A26B}">
+<ds:datastoreItem xmlns:ds="http://schemas.openxmlformats.org/officeDocument/2006/customXml" ds:itemID="{120CAF19-C495-FF4C-843D-10892E24CD0C}">
   <ds:schemaRefs>
-    <ds:schemaRef ds:uri="http://schemas.microsoft.com/office/2006/metadata/properties"/>
-    <ds:schemaRef ds:uri="http://schemas.microsoft.com/office/infopath/2007/PartnerControls"/>
-    <ds:schemaRef ds:uri="d70503b2-13f4-43ba-b220-f86cd2e276e4"/>
+    <ds:schemaRef ds:uri="http://schemas.openxmlformats.org/officeDocument/2006/bibliography"/>
   </ds:schemaRefs>
 </ds:datastoreItem>
 </file>
</xml_diff>

<commit_message>
feat: auto unit price and quantity in claim exports
</commit_message>
<xml_diff>
--- a/server/assets/claim-mould.docx
+++ b/server/assets/claim-mould.docx
@@ -483,10 +483,11 @@
             <w:tcW w:w="3862" w:type="dxa"/>
             <w:gridSpan w:val="4"/>
             <w:noWrap/>
-            <w:vAlign w:val="bottom"/>
-          </w:tcPr>
-          <w:p>
-            <w:pPr>
+            <w:vAlign w:val="center"/>
+          </w:tcPr>
+          <w:p>
+            <w:pPr>
+              <w:jc w:val="left"/>
               <w:rPr>
                 <w:rFonts w:ascii="Calibri" w:eastAsia="SimSun" w:hAnsi="Calibri" w:cs="Times New Roman"/>
                 <w:color w:val="000000"/>
@@ -5872,6 +5873,27 @@
 </file>
 
 <file path=customXml/item1.xml><?xml version="1.0" encoding="utf-8"?>
+<b:Sources xmlns:b="http://schemas.openxmlformats.org/officeDocument/2006/bibliography" xmlns="http://schemas.openxmlformats.org/officeDocument/2006/bibliography" SelectedStyle="\APASixthEditionOfficeOnline.xsl" StyleName="APA" Version="6"/>
+</file>
+
+<file path=customXml/item2.xml><?xml version="1.0" encoding="utf-8"?>
+<?mso-contentType ?>
+<FormTemplates xmlns="http://schemas.microsoft.com/sharepoint/v3/contenttype/forms">
+  <Display>DocumentLibraryForm</Display>
+  <Edit>DocumentLibraryForm</Edit>
+  <New>DocumentLibraryForm</New>
+</FormTemplates>
+</file>
+
+<file path=customXml/item3.xml><?xml version="1.0" encoding="utf-8"?>
+<p:properties xmlns:p="http://schemas.microsoft.com/office/2006/metadata/properties" xmlns:xsi="http://www.w3.org/2001/XMLSchema-instance" xmlns:pc="http://schemas.microsoft.com/office/infopath/2007/PartnerControls">
+  <documentManagement>
+    <_activity xmlns="d70503b2-13f4-43ba-b220-f86cd2e276e4" xsi:nil="true"/>
+  </documentManagement>
+</p:properties>
+</file>
+
+<file path=customXml/item4.xml><?xml version="1.0" encoding="utf-8"?>
 <ct:contentTypeSchema xmlns:ct="http://schemas.microsoft.com/office/2006/metadata/contentType" xmlns:ma="http://schemas.microsoft.com/office/2006/metadata/properties/metaAttributes" ct:_="" ma:_="" ma:contentTypeName="文档" ma:contentTypeID="0x0101002CB35B80779F104397872D4944FEDA0A" ma:contentTypeVersion="3" ma:contentTypeDescription="新建文档。" ma:contentTypeScope="" ma:versionID="c004050779e330dd1edbee6904990837">
   <xsd:schema xmlns:xsd="http://www.w3.org/2001/XMLSchema" xmlns:xs="http://www.w3.org/2001/XMLSchema" xmlns:p="http://schemas.microsoft.com/office/2006/metadata/properties" xmlns:ns3="d70503b2-13f4-43ba-b220-f86cd2e276e4" targetNamespace="http://schemas.microsoft.com/office/2006/metadata/properties" ma:root="true" ma:fieldsID="b8e247ae990a83569fecb165d9e44b71" ns3:_="">
     <xsd:import namespace="d70503b2-13f4-43ba-b220-f86cd2e276e4"/>
@@ -6009,28 +6031,33 @@
 </ct:contentTypeSchema>
 </file>
 
-<file path=customXml/item2.xml><?xml version="1.0" encoding="utf-8"?>
-<p:properties xmlns:p="http://schemas.microsoft.com/office/2006/metadata/properties" xmlns:xsi="http://www.w3.org/2001/XMLSchema-instance" xmlns:pc="http://schemas.microsoft.com/office/infopath/2007/PartnerControls">
-  <documentManagement>
-    <_activity xmlns="d70503b2-13f4-43ba-b220-f86cd2e276e4" xsi:nil="true"/>
-  </documentManagement>
-</p:properties>
+<file path=customXml/itemProps1.xml><?xml version="1.0" encoding="utf-8"?>
+<ds:datastoreItem xmlns:ds="http://schemas.openxmlformats.org/officeDocument/2006/customXml" ds:itemID="{120CAF19-C495-FF4C-843D-10892E24CD0C}">
+  <ds:schemaRefs>
+    <ds:schemaRef ds:uri="http://schemas.openxmlformats.org/officeDocument/2006/bibliography"/>
+  </ds:schemaRefs>
+</ds:datastoreItem>
 </file>
 
-<file path=customXml/item3.xml><?xml version="1.0" encoding="utf-8"?>
-<?mso-contentType ?>
-<FormTemplates xmlns="http://schemas.microsoft.com/sharepoint/v3/contenttype/forms">
-  <Display>DocumentLibraryForm</Display>
-  <Edit>DocumentLibraryForm</Edit>
-  <New>DocumentLibraryForm</New>
-</FormTemplates>
+<file path=customXml/itemProps2.xml><?xml version="1.0" encoding="utf-8"?>
+<ds:datastoreItem xmlns:ds="http://schemas.openxmlformats.org/officeDocument/2006/customXml" ds:itemID="{71616281-DD43-47E3-A1DD-39C9F497DC7A}">
+  <ds:schemaRefs>
+    <ds:schemaRef ds:uri="http://schemas.microsoft.com/sharepoint/v3/contenttype/forms"/>
+  </ds:schemaRefs>
+</ds:datastoreItem>
 </file>
 
-<file path=customXml/item4.xml><?xml version="1.0" encoding="utf-8"?>
-<b:Sources xmlns:b="http://schemas.openxmlformats.org/officeDocument/2006/bibliography" xmlns="http://schemas.openxmlformats.org/officeDocument/2006/bibliography" SelectedStyle="\APASixthEditionOfficeOnline.xsl" StyleName="APA" Version="6"/>
+<file path=customXml/itemProps3.xml><?xml version="1.0" encoding="utf-8"?>
+<ds:datastoreItem xmlns:ds="http://schemas.openxmlformats.org/officeDocument/2006/customXml" ds:itemID="{46412A0F-D8C6-4346-99B4-20A10514A26B}">
+  <ds:schemaRefs>
+    <ds:schemaRef ds:uri="http://schemas.microsoft.com/office/2006/metadata/properties"/>
+    <ds:schemaRef ds:uri="http://schemas.microsoft.com/office/infopath/2007/PartnerControls"/>
+    <ds:schemaRef ds:uri="d70503b2-13f4-43ba-b220-f86cd2e276e4"/>
+  </ds:schemaRefs>
+</ds:datastoreItem>
 </file>
 
-<file path=customXml/itemProps1.xml><?xml version="1.0" encoding="utf-8"?>
+<file path=customXml/itemProps4.xml><?xml version="1.0" encoding="utf-8"?>
 <ds:datastoreItem xmlns:ds="http://schemas.openxmlformats.org/officeDocument/2006/customXml" ds:itemID="{CCB8CC33-8799-43D4-A6FC-47A5F55BB997}">
   <ds:schemaRefs>
     <ds:schemaRef ds:uri="http://schemas.microsoft.com/office/2006/metadata/contentType"/>
@@ -6046,30 +6073,4 @@
     <ds:schemaRef ds:uri="http://schemas.microsoft.com/internal/obd"/>
   </ds:schemaRefs>
 </ds:datastoreItem>
-</file>
-
-<file path=customXml/itemProps2.xml><?xml version="1.0" encoding="utf-8"?>
-<ds:datastoreItem xmlns:ds="http://schemas.openxmlformats.org/officeDocument/2006/customXml" ds:itemID="{46412A0F-D8C6-4346-99B4-20A10514A26B}">
-  <ds:schemaRefs>
-    <ds:schemaRef ds:uri="http://schemas.microsoft.com/office/2006/metadata/properties"/>
-    <ds:schemaRef ds:uri="http://schemas.microsoft.com/office/infopath/2007/PartnerControls"/>
-    <ds:schemaRef ds:uri="d70503b2-13f4-43ba-b220-f86cd2e276e4"/>
-  </ds:schemaRefs>
-</ds:datastoreItem>
-</file>
-
-<file path=customXml/itemProps3.xml><?xml version="1.0" encoding="utf-8"?>
-<ds:datastoreItem xmlns:ds="http://schemas.openxmlformats.org/officeDocument/2006/customXml" ds:itemID="{71616281-DD43-47E3-A1DD-39C9F497DC7A}">
-  <ds:schemaRefs>
-    <ds:schemaRef ds:uri="http://schemas.microsoft.com/sharepoint/v3/contenttype/forms"/>
-  </ds:schemaRefs>
-</ds:datastoreItem>
-</file>
-
-<file path=customXml/itemProps4.xml><?xml version="1.0" encoding="utf-8"?>
-<ds:datastoreItem xmlns:ds="http://schemas.openxmlformats.org/officeDocument/2006/customXml" ds:itemID="{120CAF19-C495-FF4C-843D-10892E24CD0C}">
-  <ds:schemaRefs>
-    <ds:schemaRef ds:uri="http://schemas.openxmlformats.org/officeDocument/2006/bibliography"/>
-  </ds:schemaRefs>
-</ds:datastoreItem>
 </file>
</xml_diff>